<commit_message>
added results and conclusion to Report.docx
</commit_message>
<xml_diff>
--- a/Report.docx
+++ b/Report.docx
@@ -4,7 +4,7 @@
   <w:body>
     <w:p>
       <w:pPr>
-        <w:pStyle w:val="Heading1"/>
+        <w:pStyle w:val="berschrift1"/>
       </w:pPr>
       <w:r>
         <w:t xml:space="preserve">Report on </w:t>
@@ -33,7 +33,7 @@
     </w:p>
     <w:p>
       <w:pPr>
-        <w:pStyle w:val="Heading2"/>
+        <w:pStyle w:val="berschrift2"/>
       </w:pPr>
       <w:r>
         <w:t>Motivation</w:t>
@@ -97,7 +97,7 @@
     </w:p>
     <w:p>
       <w:pPr>
-        <w:pStyle w:val="Heading2"/>
+        <w:pStyle w:val="berschrift2"/>
       </w:pPr>
       <w:r>
         <w:t>Methods</w:t>
@@ -110,7 +110,7 @@
     </w:p>
     <w:p>
       <w:pPr>
-        <w:pStyle w:val="Heading3"/>
+        <w:pStyle w:val="berschrift3"/>
       </w:pPr>
       <w:r>
         <w:t>The voice control</w:t>
@@ -196,7 +196,7 @@
     <w:p/>
     <w:p>
       <w:pPr>
-        <w:pStyle w:val="Heading3"/>
+        <w:pStyle w:val="berschrift3"/>
       </w:pPr>
       <w:r>
         <w:t>The game</w:t>
@@ -253,6 +253,233 @@
       <w:proofErr w:type="spellEnd"/>
       <w:r>
         <w:t>/Kaldi architecture.</w:t>
+      </w:r>
+    </w:p>
+    <w:p/>
+    <w:p>
+      <w:pPr>
+        <w:pStyle w:val="berschrift1"/>
+      </w:pPr>
+      <w:r>
+        <w:t>Results</w:t>
+      </w:r>
+    </w:p>
+    <w:p>
+      <w:r>
+        <w:t xml:space="preserve">The final application successfully combines a simple game environment with a voice-controlled interface. The implemented system </w:t>
+      </w:r>
+      <w:r>
+        <w:t>can recognize</w:t>
+      </w:r>
+      <w:r>
+        <w:t xml:space="preserve"> the predefined commands “up”, “down”, “left” and “right” and translat</w:t>
+      </w:r>
+      <w:r>
+        <w:t>e</w:t>
+      </w:r>
+      <w:r>
+        <w:t xml:space="preserve"> them into movement commands for the player object inside the maze.</w:t>
+      </w:r>
+    </w:p>
+    <w:p>
+      <w:r>
+        <w:t xml:space="preserve">The </w:t>
+      </w:r>
+      <w:proofErr w:type="spellStart"/>
+      <w:r>
+        <w:t>Vosk</w:t>
+      </w:r>
+      <w:proofErr w:type="spellEnd"/>
+      <w:r>
+        <w:t xml:space="preserve"> speech recognition model performed reliably under normal speaking conditions and was able to detect commands in near real-time. Due to the relatively small vocabulary and the use of isolated comman</w:t>
+      </w:r>
+      <w:r>
+        <w:t>ds</w:t>
+      </w:r>
+      <w:r>
+        <w:t>, the recognition accuracy was sufficiently high for the purposes of the project. The response time between speaking a command and observing the movement in the game was short enough to allow intuitive gameplay.</w:t>
+      </w:r>
+    </w:p>
+    <w:p>
+      <w:r>
+        <w:t>The implemented game mechanics also functioned as intended. The player-controlled square could be navigated through the maze and successfully reach the target location using only voice commands. This demonstrates the feasibility of using speech recognition as a lightweight human-computer interaction interface within the context of biologically inspired systems.</w:t>
+      </w:r>
+    </w:p>
+    <w:p>
+      <w:r>
+        <w:t xml:space="preserve">During testing, several limitations became apparent. Background noise and unclear pronunciation occasionally </w:t>
+      </w:r>
+      <w:r>
+        <w:t>cause</w:t>
+      </w:r>
+      <w:r>
+        <w:t xml:space="preserve"> incorrect command recognition. Additionally, speech recognition performance strongly depend</w:t>
+      </w:r>
+      <w:r>
+        <w:t>s</w:t>
+      </w:r>
+      <w:r>
+        <w:t xml:space="preserve"> on the microphone quality and the operating system audio configuration. Some technical issues related to ALSA and microphone initialization on Linux systems also had to be resolved during development.</w:t>
+      </w:r>
+    </w:p>
+    <w:p/>
+    <w:p>
+      <w:pPr>
+        <w:pStyle w:val="berschrift1"/>
+      </w:pPr>
+      <w:r>
+        <w:lastRenderedPageBreak/>
+        <w:t>Conclusion</w:t>
+      </w:r>
+    </w:p>
+    <w:p>
+      <w:pPr>
+        <w:rPr>
+          <w:lang w:val="en-GB"/>
+        </w:rPr>
+      </w:pPr>
+      <w:r>
+        <w:rPr>
+          <w:lang w:val="en-GB"/>
+        </w:rPr>
+        <w:t xml:space="preserve">In this project, we developed a simple voice-controlled game as an example of a biologically inspired human-computer interface. The application combines speech recognition using the pretrained </w:t>
+      </w:r>
+      <w:proofErr w:type="spellStart"/>
+      <w:r>
+        <w:rPr>
+          <w:lang w:val="en-GB"/>
+        </w:rPr>
+        <w:t>Vosk</w:t>
+      </w:r>
+      <w:proofErr w:type="spellEnd"/>
+      <w:r>
+        <w:rPr>
+          <w:lang w:val="en-GB"/>
+        </w:rPr>
+        <w:t xml:space="preserve">/Kaldi framework with a basic maze game implemented in Python. The system </w:t>
+      </w:r>
+      <w:r>
+        <w:rPr>
+          <w:lang w:val="en-GB"/>
+        </w:rPr>
+        <w:t>can</w:t>
+      </w:r>
+      <w:r>
+        <w:rPr>
+          <w:lang w:val="en-GB"/>
+        </w:rPr>
+        <w:t xml:space="preserve"> interpret spoken directional commands and use them to control the movement of a</w:t>
+      </w:r>
+      <w:r>
+        <w:rPr>
+          <w:lang w:val="en-GB"/>
+        </w:rPr>
+        <w:t xml:space="preserve">n </w:t>
+      </w:r>
+      <w:r>
+        <w:rPr>
+          <w:lang w:val="en-GB"/>
+        </w:rPr>
+        <w:t>object in real time.</w:t>
+      </w:r>
+    </w:p>
+    <w:p>
+      <w:pPr>
+        <w:rPr>
+          <w:lang w:val="en-GB"/>
+        </w:rPr>
+      </w:pPr>
+      <w:r>
+        <w:rPr>
+          <w:lang w:val="en-GB"/>
+        </w:rPr>
+        <w:t>The project demonstrates how biologically inspired concepts such as speech processing can be integrated into interactive applications without requiring extensive computational resources or large custom training datasets. Furthermore, the project provided practical experience in handling audio input, integrating machine learning frameworks and implementing real-time interaction systems.</w:t>
+      </w:r>
+    </w:p>
+    <w:p>
+      <w:pPr>
+        <w:rPr>
+          <w:lang w:val="en-GB"/>
+        </w:rPr>
+      </w:pPr>
+      <w:r>
+        <w:rPr>
+          <w:lang w:val="en-GB"/>
+        </w:rPr>
+        <w:t>Nevertheless, the project has several limitations. The implemented speech recognition system relies entirely on pretrained models and a very limited command vocabulary. Recognition quality can deteriorate significantly in noisy environments or with unclear pronunciation.</w:t>
+      </w:r>
+      <w:r>
+        <w:rPr>
+          <w:lang w:val="en-GB"/>
+        </w:rPr>
+        <w:t xml:space="preserve"> </w:t>
+      </w:r>
+      <w:r>
+        <w:rPr>
+          <w:lang w:val="en-GB"/>
+        </w:rPr>
+        <w:t>In addition, the application currently only supports single isolated commands and does not include more advanced natural language processing capabilities.</w:t>
+      </w:r>
+    </w:p>
+    <w:p>
+      <w:pPr>
+        <w:rPr>
+          <w:lang w:val="en-GB"/>
+        </w:rPr>
+      </w:pPr>
+      <w:r>
+        <w:rPr>
+          <w:lang w:val="en-GB"/>
+        </w:rPr>
+        <w:t>Possible future extensions could include the support for continuous</w:t>
+      </w:r>
+      <w:r>
+        <w:rPr>
+          <w:lang w:val="en-GB"/>
+        </w:rPr>
+        <w:t xml:space="preserve"> </w:t>
+      </w:r>
+      <w:r>
+        <w:rPr>
+          <w:lang w:val="en-GB"/>
+        </w:rPr>
+        <w:t>speech input</w:t>
+      </w:r>
+      <w:r>
+        <w:rPr>
+          <w:lang w:val="en-GB"/>
+        </w:rPr>
+        <w:t xml:space="preserve"> and </w:t>
+      </w:r>
+      <w:r>
+        <w:rPr>
+          <w:lang w:val="en-GB"/>
+        </w:rPr>
+        <w:t xml:space="preserve">more complex game mechanics. </w:t>
+      </w:r>
+      <w:r>
+        <w:rPr>
+          <w:lang w:val="en-GB"/>
+        </w:rPr>
+        <w:t>The game used to visualize the functionality of the interface is, of course very basic, but acts as a proof of concept</w:t>
+      </w:r>
+      <w:r>
+        <w:rPr>
+          <w:lang w:val="en-GB"/>
+        </w:rPr>
+        <w:t xml:space="preserve">. </w:t>
+      </w:r>
+      <w:r>
+        <w:rPr>
+          <w:lang w:val="en-GB"/>
+        </w:rPr>
+        <w:t>Various additional improvements and extensions could be implemented but are not feasible within the scope of this</w:t>
+      </w:r>
+      <w:r>
+        <w:rPr>
+          <w:lang w:val="en-GB"/>
+        </w:rPr>
+        <w:t xml:space="preserve"> course’s final project.</w:t>
       </w:r>
     </w:p>
     <w:sectPr>
@@ -662,15 +889,15 @@
     <w:lsdException w:name="Unresolved Mention" w:semiHidden="1" w:unhideWhenUsed="1"/>
     <w:lsdException w:name="Smart Link" w:semiHidden="1" w:unhideWhenUsed="1"/>
   </w:latentStyles>
-  <w:style w:type="paragraph" w:default="1" w:styleId="Normal">
+  <w:style w:type="paragraph" w:default="1" w:styleId="Standard">
     <w:name w:val="Normal"/>
     <w:qFormat/>
   </w:style>
-  <w:style w:type="paragraph" w:styleId="Heading1">
+  <w:style w:type="paragraph" w:styleId="berschrift1">
     <w:name w:val="heading 1"/>
-    <w:basedOn w:val="Normal"/>
-    <w:next w:val="Normal"/>
-    <w:link w:val="Heading1Char"/>
+    <w:basedOn w:val="Standard"/>
+    <w:next w:val="Standard"/>
+    <w:link w:val="berschrift1Zchn"/>
     <w:uiPriority w:val="9"/>
     <w:qFormat/>
     <w:rsid w:val="00A34021"/>
@@ -687,11 +914,11 @@
       <w:szCs w:val="40"/>
     </w:rPr>
   </w:style>
-  <w:style w:type="paragraph" w:styleId="Heading2">
+  <w:style w:type="paragraph" w:styleId="berschrift2">
     <w:name w:val="heading 2"/>
-    <w:basedOn w:val="Normal"/>
-    <w:next w:val="Normal"/>
-    <w:link w:val="Heading2Char"/>
+    <w:basedOn w:val="Standard"/>
+    <w:next w:val="Standard"/>
+    <w:link w:val="berschrift2Zchn"/>
     <w:uiPriority w:val="9"/>
     <w:unhideWhenUsed/>
     <w:qFormat/>
@@ -709,11 +936,11 @@
       <w:szCs w:val="32"/>
     </w:rPr>
   </w:style>
-  <w:style w:type="paragraph" w:styleId="Heading3">
+  <w:style w:type="paragraph" w:styleId="berschrift3">
     <w:name w:val="heading 3"/>
-    <w:basedOn w:val="Normal"/>
-    <w:next w:val="Normal"/>
-    <w:link w:val="Heading3Char"/>
+    <w:basedOn w:val="Standard"/>
+    <w:next w:val="Standard"/>
+    <w:link w:val="berschrift3Zchn"/>
     <w:uiPriority w:val="9"/>
     <w:unhideWhenUsed/>
     <w:qFormat/>
@@ -731,11 +958,11 @@
       <w:szCs w:val="28"/>
     </w:rPr>
   </w:style>
-  <w:style w:type="paragraph" w:styleId="Heading4">
+  <w:style w:type="paragraph" w:styleId="berschrift4">
     <w:name w:val="heading 4"/>
-    <w:basedOn w:val="Normal"/>
-    <w:next w:val="Normal"/>
-    <w:link w:val="Heading4Char"/>
+    <w:basedOn w:val="Standard"/>
+    <w:next w:val="Standard"/>
+    <w:link w:val="berschrift4Zchn"/>
     <w:uiPriority w:val="9"/>
     <w:semiHidden/>
     <w:unhideWhenUsed/>
@@ -754,11 +981,11 @@
       <w:color w:val="2F5496" w:themeColor="accent1" w:themeShade="BF"/>
     </w:rPr>
   </w:style>
-  <w:style w:type="paragraph" w:styleId="Heading5">
+  <w:style w:type="paragraph" w:styleId="berschrift5">
     <w:name w:val="heading 5"/>
-    <w:basedOn w:val="Normal"/>
-    <w:next w:val="Normal"/>
-    <w:link w:val="Heading5Char"/>
+    <w:basedOn w:val="Standard"/>
+    <w:next w:val="Standard"/>
+    <w:link w:val="berschrift5Zchn"/>
     <w:uiPriority w:val="9"/>
     <w:semiHidden/>
     <w:unhideWhenUsed/>
@@ -775,11 +1002,11 @@
       <w:color w:val="2F5496" w:themeColor="accent1" w:themeShade="BF"/>
     </w:rPr>
   </w:style>
-  <w:style w:type="paragraph" w:styleId="Heading6">
+  <w:style w:type="paragraph" w:styleId="berschrift6">
     <w:name w:val="heading 6"/>
-    <w:basedOn w:val="Normal"/>
-    <w:next w:val="Normal"/>
-    <w:link w:val="Heading6Char"/>
+    <w:basedOn w:val="Standard"/>
+    <w:next w:val="Standard"/>
+    <w:link w:val="berschrift6Zchn"/>
     <w:uiPriority w:val="9"/>
     <w:semiHidden/>
     <w:unhideWhenUsed/>
@@ -798,11 +1025,11 @@
       <w:color w:val="595959" w:themeColor="text1" w:themeTint="A6"/>
     </w:rPr>
   </w:style>
-  <w:style w:type="paragraph" w:styleId="Heading7">
+  <w:style w:type="paragraph" w:styleId="berschrift7">
     <w:name w:val="heading 7"/>
-    <w:basedOn w:val="Normal"/>
-    <w:next w:val="Normal"/>
-    <w:link w:val="Heading7Char"/>
+    <w:basedOn w:val="Standard"/>
+    <w:next w:val="Standard"/>
+    <w:link w:val="berschrift7Zchn"/>
     <w:uiPriority w:val="9"/>
     <w:semiHidden/>
     <w:unhideWhenUsed/>
@@ -819,11 +1046,11 @@
       <w:color w:val="595959" w:themeColor="text1" w:themeTint="A6"/>
     </w:rPr>
   </w:style>
-  <w:style w:type="paragraph" w:styleId="Heading8">
+  <w:style w:type="paragraph" w:styleId="berschrift8">
     <w:name w:val="heading 8"/>
-    <w:basedOn w:val="Normal"/>
-    <w:next w:val="Normal"/>
-    <w:link w:val="Heading8Char"/>
+    <w:basedOn w:val="Standard"/>
+    <w:next w:val="Standard"/>
+    <w:link w:val="berschrift8Zchn"/>
     <w:uiPriority w:val="9"/>
     <w:semiHidden/>
     <w:unhideWhenUsed/>
@@ -842,11 +1069,11 @@
       <w:color w:val="272727" w:themeColor="text1" w:themeTint="D8"/>
     </w:rPr>
   </w:style>
-  <w:style w:type="paragraph" w:styleId="Heading9">
+  <w:style w:type="paragraph" w:styleId="berschrift9">
     <w:name w:val="heading 9"/>
-    <w:basedOn w:val="Normal"/>
-    <w:next w:val="Normal"/>
-    <w:link w:val="Heading9Char"/>
+    <w:basedOn w:val="Standard"/>
+    <w:next w:val="Standard"/>
+    <w:link w:val="berschrift9Zchn"/>
     <w:uiPriority w:val="9"/>
     <w:semiHidden/>
     <w:unhideWhenUsed/>
@@ -863,13 +1090,12 @@
       <w:color w:val="272727" w:themeColor="text1" w:themeTint="D8"/>
     </w:rPr>
   </w:style>
-  <w:style w:type="character" w:default="1" w:styleId="DefaultParagraphFont">
+  <w:style w:type="character" w:default="1" w:styleId="Absatz-Standardschriftart">
     <w:name w:val="Default Paragraph Font"/>
     <w:uiPriority w:val="1"/>
-    <w:semiHidden/>
     <w:unhideWhenUsed/>
   </w:style>
-  <w:style w:type="table" w:default="1" w:styleId="TableNormal">
+  <w:style w:type="table" w:default="1" w:styleId="NormaleTabelle">
     <w:name w:val="Normal Table"/>
     <w:uiPriority w:val="99"/>
     <w:semiHidden/>
@@ -884,16 +1110,16 @@
       </w:tblCellMar>
     </w:tblPr>
   </w:style>
-  <w:style w:type="numbering" w:default="1" w:styleId="NoList">
+  <w:style w:type="numbering" w:default="1" w:styleId="KeineListe">
     <w:name w:val="No List"/>
     <w:uiPriority w:val="99"/>
     <w:semiHidden/>
     <w:unhideWhenUsed/>
   </w:style>
-  <w:style w:type="character" w:customStyle="1" w:styleId="Heading1Char">
-    <w:name w:val="Heading 1 Char"/>
-    <w:basedOn w:val="DefaultParagraphFont"/>
-    <w:link w:val="Heading1"/>
+  <w:style w:type="character" w:customStyle="1" w:styleId="berschrift1Zchn">
+    <w:name w:val="Überschrift 1 Zchn"/>
+    <w:basedOn w:val="Absatz-Standardschriftart"/>
+    <w:link w:val="berschrift1"/>
     <w:uiPriority w:val="9"/>
     <w:rsid w:val="00A34021"/>
     <w:rPr>
@@ -903,10 +1129,10 @@
       <w:szCs w:val="40"/>
     </w:rPr>
   </w:style>
-  <w:style w:type="character" w:customStyle="1" w:styleId="Heading2Char">
-    <w:name w:val="Heading 2 Char"/>
-    <w:basedOn w:val="DefaultParagraphFont"/>
-    <w:link w:val="Heading2"/>
+  <w:style w:type="character" w:customStyle="1" w:styleId="berschrift2Zchn">
+    <w:name w:val="Überschrift 2 Zchn"/>
+    <w:basedOn w:val="Absatz-Standardschriftart"/>
+    <w:link w:val="berschrift2"/>
     <w:uiPriority w:val="9"/>
     <w:rsid w:val="00A34021"/>
     <w:rPr>
@@ -916,10 +1142,10 @@
       <w:szCs w:val="32"/>
     </w:rPr>
   </w:style>
-  <w:style w:type="character" w:customStyle="1" w:styleId="Heading3Char">
-    <w:name w:val="Heading 3 Char"/>
-    <w:basedOn w:val="DefaultParagraphFont"/>
-    <w:link w:val="Heading3"/>
+  <w:style w:type="character" w:customStyle="1" w:styleId="berschrift3Zchn">
+    <w:name w:val="Überschrift 3 Zchn"/>
+    <w:basedOn w:val="Absatz-Standardschriftart"/>
+    <w:link w:val="berschrift3"/>
     <w:uiPriority w:val="9"/>
     <w:rsid w:val="00A34021"/>
     <w:rPr>
@@ -929,10 +1155,10 @@
       <w:szCs w:val="28"/>
     </w:rPr>
   </w:style>
-  <w:style w:type="character" w:customStyle="1" w:styleId="Heading4Char">
-    <w:name w:val="Heading 4 Char"/>
-    <w:basedOn w:val="DefaultParagraphFont"/>
-    <w:link w:val="Heading4"/>
+  <w:style w:type="character" w:customStyle="1" w:styleId="berschrift4Zchn">
+    <w:name w:val="Überschrift 4 Zchn"/>
+    <w:basedOn w:val="Absatz-Standardschriftart"/>
+    <w:link w:val="berschrift4"/>
     <w:uiPriority w:val="9"/>
     <w:semiHidden/>
     <w:rsid w:val="00A34021"/>
@@ -943,10 +1169,10 @@
       <w:color w:val="2F5496" w:themeColor="accent1" w:themeShade="BF"/>
     </w:rPr>
   </w:style>
-  <w:style w:type="character" w:customStyle="1" w:styleId="Heading5Char">
-    <w:name w:val="Heading 5 Char"/>
-    <w:basedOn w:val="DefaultParagraphFont"/>
-    <w:link w:val="Heading5"/>
+  <w:style w:type="character" w:customStyle="1" w:styleId="berschrift5Zchn">
+    <w:name w:val="Überschrift 5 Zchn"/>
+    <w:basedOn w:val="Absatz-Standardschriftart"/>
+    <w:link w:val="berschrift5"/>
     <w:uiPriority w:val="9"/>
     <w:semiHidden/>
     <w:rsid w:val="00A34021"/>
@@ -955,10 +1181,10 @@
       <w:color w:val="2F5496" w:themeColor="accent1" w:themeShade="BF"/>
     </w:rPr>
   </w:style>
-  <w:style w:type="character" w:customStyle="1" w:styleId="Heading6Char">
-    <w:name w:val="Heading 6 Char"/>
-    <w:basedOn w:val="DefaultParagraphFont"/>
-    <w:link w:val="Heading6"/>
+  <w:style w:type="character" w:customStyle="1" w:styleId="berschrift6Zchn">
+    <w:name w:val="Überschrift 6 Zchn"/>
+    <w:basedOn w:val="Absatz-Standardschriftart"/>
+    <w:link w:val="berschrift6"/>
     <w:uiPriority w:val="9"/>
     <w:semiHidden/>
     <w:rsid w:val="00A34021"/>
@@ -969,10 +1195,10 @@
       <w:color w:val="595959" w:themeColor="text1" w:themeTint="A6"/>
     </w:rPr>
   </w:style>
-  <w:style w:type="character" w:customStyle="1" w:styleId="Heading7Char">
-    <w:name w:val="Heading 7 Char"/>
-    <w:basedOn w:val="DefaultParagraphFont"/>
-    <w:link w:val="Heading7"/>
+  <w:style w:type="character" w:customStyle="1" w:styleId="berschrift7Zchn">
+    <w:name w:val="Überschrift 7 Zchn"/>
+    <w:basedOn w:val="Absatz-Standardschriftart"/>
+    <w:link w:val="berschrift7"/>
     <w:uiPriority w:val="9"/>
     <w:semiHidden/>
     <w:rsid w:val="00A34021"/>
@@ -981,10 +1207,10 @@
       <w:color w:val="595959" w:themeColor="text1" w:themeTint="A6"/>
     </w:rPr>
   </w:style>
-  <w:style w:type="character" w:customStyle="1" w:styleId="Heading8Char">
-    <w:name w:val="Heading 8 Char"/>
-    <w:basedOn w:val="DefaultParagraphFont"/>
-    <w:link w:val="Heading8"/>
+  <w:style w:type="character" w:customStyle="1" w:styleId="berschrift8Zchn">
+    <w:name w:val="Überschrift 8 Zchn"/>
+    <w:basedOn w:val="Absatz-Standardschriftart"/>
+    <w:link w:val="berschrift8"/>
     <w:uiPriority w:val="9"/>
     <w:semiHidden/>
     <w:rsid w:val="00A34021"/>
@@ -995,10 +1221,10 @@
       <w:color w:val="272727" w:themeColor="text1" w:themeTint="D8"/>
     </w:rPr>
   </w:style>
-  <w:style w:type="character" w:customStyle="1" w:styleId="Heading9Char">
-    <w:name w:val="Heading 9 Char"/>
-    <w:basedOn w:val="DefaultParagraphFont"/>
-    <w:link w:val="Heading9"/>
+  <w:style w:type="character" w:customStyle="1" w:styleId="berschrift9Zchn">
+    <w:name w:val="Überschrift 9 Zchn"/>
+    <w:basedOn w:val="Absatz-Standardschriftart"/>
+    <w:link w:val="berschrift9"/>
     <w:uiPriority w:val="9"/>
     <w:semiHidden/>
     <w:rsid w:val="00A34021"/>
@@ -1007,11 +1233,11 @@
       <w:color w:val="272727" w:themeColor="text1" w:themeTint="D8"/>
     </w:rPr>
   </w:style>
-  <w:style w:type="paragraph" w:styleId="Title">
+  <w:style w:type="paragraph" w:styleId="Titel">
     <w:name w:val="Title"/>
-    <w:basedOn w:val="Normal"/>
-    <w:next w:val="Normal"/>
-    <w:link w:val="TitleChar"/>
+    <w:basedOn w:val="Standard"/>
+    <w:next w:val="Standard"/>
+    <w:link w:val="TitelZchn"/>
     <w:uiPriority w:val="10"/>
     <w:qFormat/>
     <w:rsid w:val="00A34021"/>
@@ -1027,10 +1253,10 @@
       <w:szCs w:val="56"/>
     </w:rPr>
   </w:style>
-  <w:style w:type="character" w:customStyle="1" w:styleId="TitleChar">
-    <w:name w:val="Title Char"/>
-    <w:basedOn w:val="DefaultParagraphFont"/>
-    <w:link w:val="Title"/>
+  <w:style w:type="character" w:customStyle="1" w:styleId="TitelZchn">
+    <w:name w:val="Titel Zchn"/>
+    <w:basedOn w:val="Absatz-Standardschriftart"/>
+    <w:link w:val="Titel"/>
     <w:uiPriority w:val="10"/>
     <w:rsid w:val="00A34021"/>
     <w:rPr>
@@ -1041,11 +1267,11 @@
       <w:szCs w:val="56"/>
     </w:rPr>
   </w:style>
-  <w:style w:type="paragraph" w:styleId="Subtitle">
+  <w:style w:type="paragraph" w:styleId="Untertitel">
     <w:name w:val="Subtitle"/>
-    <w:basedOn w:val="Normal"/>
-    <w:next w:val="Normal"/>
-    <w:link w:val="SubtitleChar"/>
+    <w:basedOn w:val="Standard"/>
+    <w:next w:val="Standard"/>
+    <w:link w:val="UntertitelZchn"/>
     <w:uiPriority w:val="11"/>
     <w:qFormat/>
     <w:rsid w:val="00A34021"/>
@@ -1062,10 +1288,10 @@
       <w:szCs w:val="28"/>
     </w:rPr>
   </w:style>
-  <w:style w:type="character" w:customStyle="1" w:styleId="SubtitleChar">
-    <w:name w:val="Subtitle Char"/>
-    <w:basedOn w:val="DefaultParagraphFont"/>
-    <w:link w:val="Subtitle"/>
+  <w:style w:type="character" w:customStyle="1" w:styleId="UntertitelZchn">
+    <w:name w:val="Untertitel Zchn"/>
+    <w:basedOn w:val="Absatz-Standardschriftart"/>
+    <w:link w:val="Untertitel"/>
     <w:uiPriority w:val="11"/>
     <w:rsid w:val="00A34021"/>
     <w:rPr>
@@ -1076,11 +1302,11 @@
       <w:szCs w:val="28"/>
     </w:rPr>
   </w:style>
-  <w:style w:type="paragraph" w:styleId="Quote">
+  <w:style w:type="paragraph" w:styleId="Zitat">
     <w:name w:val="Quote"/>
-    <w:basedOn w:val="Normal"/>
-    <w:next w:val="Normal"/>
-    <w:link w:val="QuoteChar"/>
+    <w:basedOn w:val="Standard"/>
+    <w:next w:val="Standard"/>
+    <w:link w:val="ZitatZchn"/>
     <w:uiPriority w:val="29"/>
     <w:qFormat/>
     <w:rsid w:val="00A34021"/>
@@ -1094,10 +1320,10 @@
       <w:color w:val="404040" w:themeColor="text1" w:themeTint="BF"/>
     </w:rPr>
   </w:style>
-  <w:style w:type="character" w:customStyle="1" w:styleId="QuoteChar">
-    <w:name w:val="Quote Char"/>
-    <w:basedOn w:val="DefaultParagraphFont"/>
-    <w:link w:val="Quote"/>
+  <w:style w:type="character" w:customStyle="1" w:styleId="ZitatZchn">
+    <w:name w:val="Zitat Zchn"/>
+    <w:basedOn w:val="Absatz-Standardschriftart"/>
+    <w:link w:val="Zitat"/>
     <w:uiPriority w:val="29"/>
     <w:rsid w:val="00A34021"/>
     <w:rPr>
@@ -1106,9 +1332,9 @@
       <w:color w:val="404040" w:themeColor="text1" w:themeTint="BF"/>
     </w:rPr>
   </w:style>
-  <w:style w:type="paragraph" w:styleId="ListParagraph">
+  <w:style w:type="paragraph" w:styleId="Listenabsatz">
     <w:name w:val="List Paragraph"/>
-    <w:basedOn w:val="Normal"/>
+    <w:basedOn w:val="Standard"/>
     <w:uiPriority w:val="34"/>
     <w:qFormat/>
     <w:rsid w:val="00A34021"/>
@@ -1117,9 +1343,9 @@
       <w:contextualSpacing/>
     </w:pPr>
   </w:style>
-  <w:style w:type="character" w:styleId="IntenseEmphasis">
+  <w:style w:type="character" w:styleId="IntensiveHervorhebung">
     <w:name w:val="Intense Emphasis"/>
-    <w:basedOn w:val="DefaultParagraphFont"/>
+    <w:basedOn w:val="Absatz-Standardschriftart"/>
     <w:uiPriority w:val="21"/>
     <w:qFormat/>
     <w:rsid w:val="00A34021"/>
@@ -1129,11 +1355,11 @@
       <w:color w:val="2F5496" w:themeColor="accent1" w:themeShade="BF"/>
     </w:rPr>
   </w:style>
-  <w:style w:type="paragraph" w:styleId="IntenseQuote">
+  <w:style w:type="paragraph" w:styleId="IntensivesZitat">
     <w:name w:val="Intense Quote"/>
-    <w:basedOn w:val="Normal"/>
-    <w:next w:val="Normal"/>
-    <w:link w:val="IntenseQuoteChar"/>
+    <w:basedOn w:val="Standard"/>
+    <w:next w:val="Standard"/>
+    <w:link w:val="IntensivesZitatZchn"/>
     <w:uiPriority w:val="30"/>
     <w:qFormat/>
     <w:rsid w:val="00A34021"/>
@@ -1152,10 +1378,10 @@
       <w:color w:val="2F5496" w:themeColor="accent1" w:themeShade="BF"/>
     </w:rPr>
   </w:style>
-  <w:style w:type="character" w:customStyle="1" w:styleId="IntenseQuoteChar">
-    <w:name w:val="Intense Quote Char"/>
-    <w:basedOn w:val="DefaultParagraphFont"/>
-    <w:link w:val="IntenseQuote"/>
+  <w:style w:type="character" w:customStyle="1" w:styleId="IntensivesZitatZchn">
+    <w:name w:val="Intensives Zitat Zchn"/>
+    <w:basedOn w:val="Absatz-Standardschriftart"/>
+    <w:link w:val="IntensivesZitat"/>
     <w:uiPriority w:val="30"/>
     <w:rsid w:val="00A34021"/>
     <w:rPr>
@@ -1164,9 +1390,9 @@
       <w:color w:val="2F5496" w:themeColor="accent1" w:themeShade="BF"/>
     </w:rPr>
   </w:style>
-  <w:style w:type="character" w:styleId="IntenseReference">
+  <w:style w:type="character" w:styleId="IntensiverVerweis">
     <w:name w:val="Intense Reference"/>
-    <w:basedOn w:val="DefaultParagraphFont"/>
+    <w:basedOn w:val="Absatz-Standardschriftart"/>
     <w:uiPriority w:val="32"/>
     <w:qFormat/>
     <w:rsid w:val="00A34021"/>

</xml_diff>

<commit_message>
Update presentation and report
</commit_message>
<xml_diff>
--- a/Report.docx
+++ b/Report.docx
@@ -4,7 +4,7 @@
   <w:body>
     <w:p>
       <w:pPr>
-        <w:pStyle w:val="berschrift1"/>
+        <w:pStyle w:val="Heading1"/>
       </w:pPr>
       <w:r>
         <w:t xml:space="preserve">Report on </w:t>
@@ -33,7 +33,7 @@
     </w:p>
     <w:p>
       <w:pPr>
-        <w:pStyle w:val="berschrift2"/>
+        <w:pStyle w:val="Heading2"/>
       </w:pPr>
       <w:r>
         <w:t>Motivation</w:t>
@@ -56,15 +56,7 @@
     </w:p>
     <w:p>
       <w:r>
-        <w:t xml:space="preserve">Using a webcam is highly dependent on things like lighting or the resolution of the webcam. This could potentially be solved using a large and heterogenous training </w:t>
-      </w:r>
-      <w:proofErr w:type="gramStart"/>
-      <w:r>
-        <w:t>dataset,</w:t>
-      </w:r>
-      <w:proofErr w:type="gramEnd"/>
-      <w:r>
-        <w:t xml:space="preserve"> however, we have neither the means of time nor the computing power</w:t>
+        <w:t>Using a webcam is highly dependent on things like lighting or the resolution of the webcam. This could potentially be solved using a large and heterogenous training dataset, however, we have neither the means of time nor the computing power</w:t>
       </w:r>
       <w:r>
         <w:t xml:space="preserve"> and storage</w:t>
@@ -97,7 +89,7 @@
     </w:p>
     <w:p>
       <w:pPr>
-        <w:pStyle w:val="berschrift2"/>
+        <w:pStyle w:val="Heading2"/>
       </w:pPr>
       <w:r>
         <w:t>Methods</w:t>
@@ -110,93 +102,242 @@
     </w:p>
     <w:p>
       <w:pPr>
-        <w:pStyle w:val="berschrift3"/>
+        <w:pStyle w:val="Heading3"/>
       </w:pPr>
       <w:r>
         <w:t>The voice control</w:t>
       </w:r>
     </w:p>
     <w:p>
-      <w:r>
-        <w:t xml:space="preserve">For the voice control we are using a pretrained model called </w:t>
+      <w:pPr>
+        <w:rPr>
+          <w:lang w:val="en-GB"/>
+        </w:rPr>
+      </w:pPr>
+      <w:r>
+        <w:rPr>
+          <w:lang w:val="en-GB"/>
+        </w:rPr>
+        <w:t xml:space="preserve">For the voice control, we use a pretrained speech recognition model called </w:t>
       </w:r>
       <w:proofErr w:type="spellStart"/>
       <w:r>
+        <w:rPr>
+          <w:lang w:val="en-GB"/>
+        </w:rPr>
         <w:t>Vosk</w:t>
       </w:r>
       <w:proofErr w:type="spellEnd"/>
       <w:r>
-        <w:t>. It is to a larger extent based on the Kaldi</w:t>
-      </w:r>
-      <w:r>
-        <w:t xml:space="preserve"> Speech Recognition Toolkit, which is the result of multiple years of research by Daniel Povey et. al.</w:t>
-      </w:r>
-    </w:p>
-    <w:p>
-      <w:r>
-        <w:t xml:space="preserve">Kaldi’s exact structure is quite complex, but in </w:t>
-      </w:r>
-      <w:r>
-        <w:t>the following</w:t>
-      </w:r>
-      <w:r>
-        <w:t xml:space="preserve"> paragraph</w:t>
-      </w:r>
-      <w:r>
-        <w:t>s</w:t>
-      </w:r>
-      <w:r>
-        <w:t xml:space="preserve"> we are going to give a quick overview of how it works. The audio input data is processed using M</w:t>
-      </w:r>
-      <w:r>
-        <w:t xml:space="preserve">el spectrograms, which is a logarithmic representation of the spectrograph, more suitable for human speech tasks. The extracted features are called Mel-frequency cepstral coefficients (MFCC). </w:t>
-      </w:r>
-    </w:p>
-    <w:p>
-      <w:r>
-        <w:t xml:space="preserve">The MFCC are then passed into a Deep Neural Networks (DNN), which in turn outputs a probability density function. This is fed into Hidden Markov Models (HMM), which are a special kind of stochastic machine learning model widely used today. The HMM’s output depends on the outcomes of hidden states, which </w:t>
+        <w:rPr>
+          <w:lang w:val="en-GB"/>
+        </w:rPr>
+        <w:t xml:space="preserve">. </w:t>
+      </w:r>
+      <w:r>
+        <w:rPr>
+          <w:lang w:val="en-GB"/>
+        </w:rPr>
+        <w:t>It</w:t>
+      </w:r>
+      <w:r>
+        <w:rPr>
+          <w:lang w:val="en-GB"/>
+        </w:rPr>
+        <w:t xml:space="preserve"> is largely based on the Kaldi Speech Recognition Toolkit, which is the result of many years of research by Daniel Povey et al.</w:t>
+      </w:r>
+    </w:p>
+    <w:p>
+      <w:pPr>
+        <w:rPr>
+          <w:lang w:val="en-GB"/>
+        </w:rPr>
+      </w:pPr>
+      <w:r>
+        <w:rPr>
+          <w:lang w:val="en-GB"/>
+        </w:rPr>
+        <w:t>Kaldi’s architecture is quite complex, but the following paragraphs give a simplified overview of the speech recognition pipeline.</w:t>
+      </w:r>
+    </w:p>
+    <w:p>
+      <w:pPr>
+        <w:rPr>
+          <w:lang w:val="en-GB"/>
+        </w:rPr>
+      </w:pPr>
+      <w:r>
+        <w:rPr>
+          <w:lang w:val="en-GB"/>
+        </w:rPr>
+        <w:t>The process starts with raw audio input from the microphone. The audio signal is transformed into Mel-frequency cepstral coefficients (MFCCs), which are mathematical feature representations based on the Mel scale and are well suited for speech recognition tasks.</w:t>
+      </w:r>
+    </w:p>
+    <w:p>
+      <w:r>
+        <w:t>The extracted MFCC features are then passed into an acoustic model. In our pipeline, we refer to a GMM-HMM based acoustic model, which combines Gaussian Mixture Models (GMMs) and Hidden Markov Models (HMMs). GMMs are used to model the probabilities of speech sounds, while HMMs model how speech changes over time and predict likely phoneme transitions.</w:t>
+      </w:r>
+      <w:r>
+        <w:t xml:space="preserve"> </w:t>
+      </w:r>
+      <w:r>
+        <w:rPr>
+          <w:highlight w:val="yellow"/>
+          <w:lang w:val="en-GB"/>
+        </w:rPr>
+        <w:t>Modern Kaldi/</w:t>
       </w:r>
       <w:proofErr w:type="spellStart"/>
       <w:r>
-        <w:t>can not</w:t>
+        <w:rPr>
+          <w:highlight w:val="yellow"/>
+          <w:lang w:val="en-GB"/>
+        </w:rPr>
+        <w:t>Vosk</w:t>
       </w:r>
       <w:proofErr w:type="spellEnd"/>
       <w:r>
-        <w:t xml:space="preserve"> directly be observed. These are implemented using Weighted Finite-State Transducers. </w:t>
-      </w:r>
-      <w:r>
-        <w:t xml:space="preserve">The resulting probabilities are associated with </w:t>
-      </w:r>
-      <w:r>
+        <w:rPr>
+          <w:highlight w:val="yellow"/>
+          <w:lang w:val="en-GB"/>
+        </w:rPr>
+        <w:t xml:space="preserve"> systems commonly use Deep Neural Networks (DNNs) together with Hidden </w:t>
+      </w:r>
+      <w:r>
+        <w:rPr>
+          <w:highlight w:val="yellow"/>
+          <w:lang w:val="en-GB"/>
+        </w:rPr>
         <w:lastRenderedPageBreak/>
-        <w:t>different phonemes, which in turn need to be parsed using different lexicons for pronunciation and words, dependent on the language modeled.</w:t>
-      </w:r>
-    </w:p>
-    <w:p>
-      <w:r>
-        <w:t xml:space="preserve">Parts of these algorithms far exceed the courses content and require a solid understand of various fields of mathematics. However, the implementation of the speech recognition using </w:t>
+        <w:t>Markov Models (HMMs). The DNN estimates the probabilities of different speech sounds, while the HMM models how speech evolves over time and predicts likely phoneme transitions.</w:t>
+      </w:r>
+    </w:p>
+    <w:p>
+      <w:r>
+        <w:rPr>
+          <w:lang w:val="en-GB"/>
+        </w:rPr>
+        <w:t xml:space="preserve">In addition, a language model is used to predict the most likely word sequences using statistical word probabilities and grammar information. </w:t>
+      </w:r>
+      <w:r>
+        <w:t>Finally, a decoder combines the outputs of the acoustic and language model in order to determine the most probable sentence or command. Kaldi internally uses Weighted Finite-State Transducers (WFSTs) during this decoding process.</w:t>
+      </w:r>
+    </w:p>
+    <w:p>
+      <w:pPr>
+        <w:rPr>
+          <w:lang w:val="en-GB"/>
+        </w:rPr>
+      </w:pPr>
+      <w:r>
+        <w:rPr>
+          <w:lang w:val="en-GB"/>
+        </w:rPr>
+        <w:t xml:space="preserve">The resulting text is returned by the </w:t>
       </w:r>
       <w:proofErr w:type="spellStart"/>
       <w:r>
+        <w:rPr>
+          <w:lang w:val="en-GB"/>
+        </w:rPr>
         <w:t>Vosk</w:t>
       </w:r>
       <w:proofErr w:type="spellEnd"/>
       <w:r>
-        <w:t xml:space="preserve"> is quite easy, as the model is already pretrained and the </w:t>
+        <w:rPr>
+          <w:lang w:val="en-GB"/>
+        </w:rPr>
+        <w:t xml:space="preserve"> API and can then be processed by the application. In our project, commands such as “up”, “down”, “left”, “right”, and “exit” are extracted from the recognized text and used to control the maze game.</w:t>
+      </w:r>
+    </w:p>
+    <w:p>
+      <w:pPr>
+        <w:rPr>
+          <w:lang w:val="en-GB"/>
+        </w:rPr>
+      </w:pPr>
+      <w:r>
+        <w:rPr>
+          <w:lang w:val="en-GB"/>
+        </w:rPr>
+        <w:t xml:space="preserve">Depending on the benchmark and dataset, </w:t>
       </w:r>
       <w:proofErr w:type="spellStart"/>
       <w:r>
+        <w:rPr>
+          <w:lang w:val="en-GB"/>
+        </w:rPr>
         <w:t>Vosk</w:t>
       </w:r>
       <w:proofErr w:type="spellEnd"/>
       <w:r>
-        <w:t xml:space="preserve"> API is intuitive.</w:t>
-      </w:r>
-    </w:p>
-    <w:p/>
+        <w:rPr>
+          <w:lang w:val="en-GB"/>
+        </w:rPr>
+        <w:t xml:space="preserve">/Kaldi systems achieve a Word Error Rate (WER) of approximately 9.85% on </w:t>
+      </w:r>
+      <w:proofErr w:type="spellStart"/>
+      <w:r>
+        <w:rPr>
+          <w:lang w:val="en-GB"/>
+        </w:rPr>
+        <w:t>LibriSpeech</w:t>
+      </w:r>
+      <w:proofErr w:type="spellEnd"/>
+      <w:r>
+        <w:rPr>
+          <w:lang w:val="en-GB"/>
+        </w:rPr>
+        <w:t xml:space="preserve"> test-clean and around 10.38% on TED-LIUM datasets. Since our project only uses a small set of simple commands, the practical recognition accuracy is significantly higher.</w:t>
+      </w:r>
+    </w:p>
     <w:p>
       <w:pPr>
-        <w:pStyle w:val="berschrift3"/>
+        <w:pStyle w:val="Heading3"/>
+        <w:rPr>
+          <w:rFonts w:eastAsiaTheme="minorHAnsi" w:cstheme="minorBidi"/>
+          <w:color w:val="auto"/>
+          <w:sz w:val="24"/>
+          <w:szCs w:val="24"/>
+          <w:lang w:val="en-GB"/>
+        </w:rPr>
+      </w:pPr>
+      <w:r>
+        <w:rPr>
+          <w:rFonts w:eastAsiaTheme="minorHAnsi" w:cstheme="minorBidi"/>
+          <w:color w:val="auto"/>
+          <w:sz w:val="24"/>
+          <w:szCs w:val="24"/>
+          <w:lang w:val="en-GB"/>
+        </w:rPr>
+        <w:t xml:space="preserve">Although the mathematical background of these algorithms exceeds the scope of this course, the implementation using the </w:t>
+      </w:r>
+      <w:proofErr w:type="spellStart"/>
+      <w:r>
+        <w:rPr>
+          <w:rFonts w:eastAsiaTheme="minorHAnsi" w:cstheme="minorBidi"/>
+          <w:color w:val="auto"/>
+          <w:sz w:val="24"/>
+          <w:szCs w:val="24"/>
+          <w:lang w:val="en-GB"/>
+        </w:rPr>
+        <w:t>Vosk</w:t>
+      </w:r>
+      <w:proofErr w:type="spellEnd"/>
+      <w:r>
+        <w:rPr>
+          <w:rFonts w:eastAsiaTheme="minorHAnsi" w:cstheme="minorBidi"/>
+          <w:color w:val="auto"/>
+          <w:sz w:val="24"/>
+          <w:szCs w:val="24"/>
+          <w:lang w:val="en-GB"/>
+        </w:rPr>
+        <w:t xml:space="preserve"> API is relatively straightforward, since the models are already pretrained and the API is intuitive to use.</w:t>
+      </w:r>
+    </w:p>
+    <w:p>
+      <w:pPr>
+        <w:pStyle w:val="Heading3"/>
       </w:pPr>
       <w:r>
         <w:t>The game</w:t>
@@ -258,7 +399,7 @@
     <w:p/>
     <w:p>
       <w:pPr>
-        <w:pStyle w:val="berschrift1"/>
+        <w:pStyle w:val="Heading1"/>
       </w:pPr>
       <w:r>
         <w:t>Results</w:t>
@@ -302,6 +443,7 @@
     </w:p>
     <w:p>
       <w:r>
+        <w:lastRenderedPageBreak/>
         <w:t>The implemented game mechanics also functioned as intended. The player-controlled square could be navigated through the maze and successfully reach the target location using only voice commands. This demonstrates the feasibility of using speech recognition as a lightweight human-computer interaction interface within the context of biologically inspired systems.</w:t>
       </w:r>
     </w:p>
@@ -325,10 +467,9 @@
     <w:p/>
     <w:p>
       <w:pPr>
-        <w:pStyle w:val="berschrift1"/>
+        <w:pStyle w:val="Heading1"/>
       </w:pPr>
       <w:r>
-        <w:lastRenderedPageBreak/>
         <w:t>Conclusion</w:t>
       </w:r>
     </w:p>
@@ -356,19 +497,7 @@
         <w:rPr>
           <w:lang w:val="en-GB"/>
         </w:rPr>
-        <w:t xml:space="preserve">/Kaldi framework with a basic maze game implemented in Python. The system </w:t>
-      </w:r>
-      <w:r>
-        <w:rPr>
-          <w:lang w:val="en-GB"/>
-        </w:rPr>
-        <w:t>can</w:t>
-      </w:r>
-      <w:r>
-        <w:rPr>
-          <w:lang w:val="en-GB"/>
-        </w:rPr>
-        <w:t xml:space="preserve"> interpret spoken directional commands and use them to control the movement of a</w:t>
+        <w:t>/Kaldi framework with a basic maze game implemented in Python. The system can interpret spoken directional commands and use them to control the movement of a</w:t>
       </w:r>
       <w:r>
         <w:rPr>
@@ -889,15 +1018,15 @@
     <w:lsdException w:name="Unresolved Mention" w:semiHidden="1" w:unhideWhenUsed="1"/>
     <w:lsdException w:name="Smart Link" w:semiHidden="1" w:unhideWhenUsed="1"/>
   </w:latentStyles>
-  <w:style w:type="paragraph" w:default="1" w:styleId="Standard">
+  <w:style w:type="paragraph" w:default="1" w:styleId="Normal">
     <w:name w:val="Normal"/>
     <w:qFormat/>
   </w:style>
-  <w:style w:type="paragraph" w:styleId="berschrift1">
+  <w:style w:type="paragraph" w:styleId="Heading1">
     <w:name w:val="heading 1"/>
-    <w:basedOn w:val="Standard"/>
-    <w:next w:val="Standard"/>
-    <w:link w:val="berschrift1Zchn"/>
+    <w:basedOn w:val="Normal"/>
+    <w:next w:val="Normal"/>
+    <w:link w:val="Heading1Char"/>
     <w:uiPriority w:val="9"/>
     <w:qFormat/>
     <w:rsid w:val="00A34021"/>
@@ -914,11 +1043,11 @@
       <w:szCs w:val="40"/>
     </w:rPr>
   </w:style>
-  <w:style w:type="paragraph" w:styleId="berschrift2">
+  <w:style w:type="paragraph" w:styleId="Heading2">
     <w:name w:val="heading 2"/>
-    <w:basedOn w:val="Standard"/>
-    <w:next w:val="Standard"/>
-    <w:link w:val="berschrift2Zchn"/>
+    <w:basedOn w:val="Normal"/>
+    <w:next w:val="Normal"/>
+    <w:link w:val="Heading2Char"/>
     <w:uiPriority w:val="9"/>
     <w:unhideWhenUsed/>
     <w:qFormat/>
@@ -936,11 +1065,11 @@
       <w:szCs w:val="32"/>
     </w:rPr>
   </w:style>
-  <w:style w:type="paragraph" w:styleId="berschrift3">
+  <w:style w:type="paragraph" w:styleId="Heading3">
     <w:name w:val="heading 3"/>
-    <w:basedOn w:val="Standard"/>
-    <w:next w:val="Standard"/>
-    <w:link w:val="berschrift3Zchn"/>
+    <w:basedOn w:val="Normal"/>
+    <w:next w:val="Normal"/>
+    <w:link w:val="Heading3Char"/>
     <w:uiPriority w:val="9"/>
     <w:unhideWhenUsed/>
     <w:qFormat/>
@@ -958,11 +1087,11 @@
       <w:szCs w:val="28"/>
     </w:rPr>
   </w:style>
-  <w:style w:type="paragraph" w:styleId="berschrift4">
+  <w:style w:type="paragraph" w:styleId="Heading4">
     <w:name w:val="heading 4"/>
-    <w:basedOn w:val="Standard"/>
-    <w:next w:val="Standard"/>
-    <w:link w:val="berschrift4Zchn"/>
+    <w:basedOn w:val="Normal"/>
+    <w:next w:val="Normal"/>
+    <w:link w:val="Heading4Char"/>
     <w:uiPriority w:val="9"/>
     <w:semiHidden/>
     <w:unhideWhenUsed/>
@@ -981,11 +1110,11 @@
       <w:color w:val="2F5496" w:themeColor="accent1" w:themeShade="BF"/>
     </w:rPr>
   </w:style>
-  <w:style w:type="paragraph" w:styleId="berschrift5">
+  <w:style w:type="paragraph" w:styleId="Heading5">
     <w:name w:val="heading 5"/>
-    <w:basedOn w:val="Standard"/>
-    <w:next w:val="Standard"/>
-    <w:link w:val="berschrift5Zchn"/>
+    <w:basedOn w:val="Normal"/>
+    <w:next w:val="Normal"/>
+    <w:link w:val="Heading5Char"/>
     <w:uiPriority w:val="9"/>
     <w:semiHidden/>
     <w:unhideWhenUsed/>
@@ -1002,11 +1131,11 @@
       <w:color w:val="2F5496" w:themeColor="accent1" w:themeShade="BF"/>
     </w:rPr>
   </w:style>
-  <w:style w:type="paragraph" w:styleId="berschrift6">
+  <w:style w:type="paragraph" w:styleId="Heading6">
     <w:name w:val="heading 6"/>
-    <w:basedOn w:val="Standard"/>
-    <w:next w:val="Standard"/>
-    <w:link w:val="berschrift6Zchn"/>
+    <w:basedOn w:val="Normal"/>
+    <w:next w:val="Normal"/>
+    <w:link w:val="Heading6Char"/>
     <w:uiPriority w:val="9"/>
     <w:semiHidden/>
     <w:unhideWhenUsed/>
@@ -1025,11 +1154,11 @@
       <w:color w:val="595959" w:themeColor="text1" w:themeTint="A6"/>
     </w:rPr>
   </w:style>
-  <w:style w:type="paragraph" w:styleId="berschrift7">
+  <w:style w:type="paragraph" w:styleId="Heading7">
     <w:name w:val="heading 7"/>
-    <w:basedOn w:val="Standard"/>
-    <w:next w:val="Standard"/>
-    <w:link w:val="berschrift7Zchn"/>
+    <w:basedOn w:val="Normal"/>
+    <w:next w:val="Normal"/>
+    <w:link w:val="Heading7Char"/>
     <w:uiPriority w:val="9"/>
     <w:semiHidden/>
     <w:unhideWhenUsed/>
@@ -1046,11 +1175,11 @@
       <w:color w:val="595959" w:themeColor="text1" w:themeTint="A6"/>
     </w:rPr>
   </w:style>
-  <w:style w:type="paragraph" w:styleId="berschrift8">
+  <w:style w:type="paragraph" w:styleId="Heading8">
     <w:name w:val="heading 8"/>
-    <w:basedOn w:val="Standard"/>
-    <w:next w:val="Standard"/>
-    <w:link w:val="berschrift8Zchn"/>
+    <w:basedOn w:val="Normal"/>
+    <w:next w:val="Normal"/>
+    <w:link w:val="Heading8Char"/>
     <w:uiPriority w:val="9"/>
     <w:semiHidden/>
     <w:unhideWhenUsed/>
@@ -1069,11 +1198,11 @@
       <w:color w:val="272727" w:themeColor="text1" w:themeTint="D8"/>
     </w:rPr>
   </w:style>
-  <w:style w:type="paragraph" w:styleId="berschrift9">
+  <w:style w:type="paragraph" w:styleId="Heading9">
     <w:name w:val="heading 9"/>
-    <w:basedOn w:val="Standard"/>
-    <w:next w:val="Standard"/>
-    <w:link w:val="berschrift9Zchn"/>
+    <w:basedOn w:val="Normal"/>
+    <w:next w:val="Normal"/>
+    <w:link w:val="Heading9Char"/>
     <w:uiPriority w:val="9"/>
     <w:semiHidden/>
     <w:unhideWhenUsed/>
@@ -1090,12 +1219,12 @@
       <w:color w:val="272727" w:themeColor="text1" w:themeTint="D8"/>
     </w:rPr>
   </w:style>
-  <w:style w:type="character" w:default="1" w:styleId="Absatz-Standardschriftart">
+  <w:style w:type="character" w:default="1" w:styleId="DefaultParagraphFont">
     <w:name w:val="Default Paragraph Font"/>
     <w:uiPriority w:val="1"/>
     <w:unhideWhenUsed/>
   </w:style>
-  <w:style w:type="table" w:default="1" w:styleId="NormaleTabelle">
+  <w:style w:type="table" w:default="1" w:styleId="TableNormal">
     <w:name w:val="Normal Table"/>
     <w:uiPriority w:val="99"/>
     <w:semiHidden/>
@@ -1110,16 +1239,16 @@
       </w:tblCellMar>
     </w:tblPr>
   </w:style>
-  <w:style w:type="numbering" w:default="1" w:styleId="KeineListe">
+  <w:style w:type="numbering" w:default="1" w:styleId="NoList">
     <w:name w:val="No List"/>
     <w:uiPriority w:val="99"/>
     <w:semiHidden/>
     <w:unhideWhenUsed/>
   </w:style>
-  <w:style w:type="character" w:customStyle="1" w:styleId="berschrift1Zchn">
-    <w:name w:val="Überschrift 1 Zchn"/>
-    <w:basedOn w:val="Absatz-Standardschriftart"/>
-    <w:link w:val="berschrift1"/>
+  <w:style w:type="character" w:customStyle="1" w:styleId="Heading1Char">
+    <w:name w:val="Heading 1 Char"/>
+    <w:basedOn w:val="DefaultParagraphFont"/>
+    <w:link w:val="Heading1"/>
     <w:uiPriority w:val="9"/>
     <w:rsid w:val="00A34021"/>
     <w:rPr>
@@ -1129,10 +1258,10 @@
       <w:szCs w:val="40"/>
     </w:rPr>
   </w:style>
-  <w:style w:type="character" w:customStyle="1" w:styleId="berschrift2Zchn">
-    <w:name w:val="Überschrift 2 Zchn"/>
-    <w:basedOn w:val="Absatz-Standardschriftart"/>
-    <w:link w:val="berschrift2"/>
+  <w:style w:type="character" w:customStyle="1" w:styleId="Heading2Char">
+    <w:name w:val="Heading 2 Char"/>
+    <w:basedOn w:val="DefaultParagraphFont"/>
+    <w:link w:val="Heading2"/>
     <w:uiPriority w:val="9"/>
     <w:rsid w:val="00A34021"/>
     <w:rPr>
@@ -1142,10 +1271,10 @@
       <w:szCs w:val="32"/>
     </w:rPr>
   </w:style>
-  <w:style w:type="character" w:customStyle="1" w:styleId="berschrift3Zchn">
-    <w:name w:val="Überschrift 3 Zchn"/>
-    <w:basedOn w:val="Absatz-Standardschriftart"/>
-    <w:link w:val="berschrift3"/>
+  <w:style w:type="character" w:customStyle="1" w:styleId="Heading3Char">
+    <w:name w:val="Heading 3 Char"/>
+    <w:basedOn w:val="DefaultParagraphFont"/>
+    <w:link w:val="Heading3"/>
     <w:uiPriority w:val="9"/>
     <w:rsid w:val="00A34021"/>
     <w:rPr>
@@ -1155,10 +1284,10 @@
       <w:szCs w:val="28"/>
     </w:rPr>
   </w:style>
-  <w:style w:type="character" w:customStyle="1" w:styleId="berschrift4Zchn">
-    <w:name w:val="Überschrift 4 Zchn"/>
-    <w:basedOn w:val="Absatz-Standardschriftart"/>
-    <w:link w:val="berschrift4"/>
+  <w:style w:type="character" w:customStyle="1" w:styleId="Heading4Char">
+    <w:name w:val="Heading 4 Char"/>
+    <w:basedOn w:val="DefaultParagraphFont"/>
+    <w:link w:val="Heading4"/>
     <w:uiPriority w:val="9"/>
     <w:semiHidden/>
     <w:rsid w:val="00A34021"/>
@@ -1169,10 +1298,10 @@
       <w:color w:val="2F5496" w:themeColor="accent1" w:themeShade="BF"/>
     </w:rPr>
   </w:style>
-  <w:style w:type="character" w:customStyle="1" w:styleId="berschrift5Zchn">
-    <w:name w:val="Überschrift 5 Zchn"/>
-    <w:basedOn w:val="Absatz-Standardschriftart"/>
-    <w:link w:val="berschrift5"/>
+  <w:style w:type="character" w:customStyle="1" w:styleId="Heading5Char">
+    <w:name w:val="Heading 5 Char"/>
+    <w:basedOn w:val="DefaultParagraphFont"/>
+    <w:link w:val="Heading5"/>
     <w:uiPriority w:val="9"/>
     <w:semiHidden/>
     <w:rsid w:val="00A34021"/>
@@ -1181,10 +1310,10 @@
       <w:color w:val="2F5496" w:themeColor="accent1" w:themeShade="BF"/>
     </w:rPr>
   </w:style>
-  <w:style w:type="character" w:customStyle="1" w:styleId="berschrift6Zchn">
-    <w:name w:val="Überschrift 6 Zchn"/>
-    <w:basedOn w:val="Absatz-Standardschriftart"/>
-    <w:link w:val="berschrift6"/>
+  <w:style w:type="character" w:customStyle="1" w:styleId="Heading6Char">
+    <w:name w:val="Heading 6 Char"/>
+    <w:basedOn w:val="DefaultParagraphFont"/>
+    <w:link w:val="Heading6"/>
     <w:uiPriority w:val="9"/>
     <w:semiHidden/>
     <w:rsid w:val="00A34021"/>
@@ -1195,10 +1324,10 @@
       <w:color w:val="595959" w:themeColor="text1" w:themeTint="A6"/>
     </w:rPr>
   </w:style>
-  <w:style w:type="character" w:customStyle="1" w:styleId="berschrift7Zchn">
-    <w:name w:val="Überschrift 7 Zchn"/>
-    <w:basedOn w:val="Absatz-Standardschriftart"/>
-    <w:link w:val="berschrift7"/>
+  <w:style w:type="character" w:customStyle="1" w:styleId="Heading7Char">
+    <w:name w:val="Heading 7 Char"/>
+    <w:basedOn w:val="DefaultParagraphFont"/>
+    <w:link w:val="Heading7"/>
     <w:uiPriority w:val="9"/>
     <w:semiHidden/>
     <w:rsid w:val="00A34021"/>
@@ -1207,10 +1336,10 @@
       <w:color w:val="595959" w:themeColor="text1" w:themeTint="A6"/>
     </w:rPr>
   </w:style>
-  <w:style w:type="character" w:customStyle="1" w:styleId="berschrift8Zchn">
-    <w:name w:val="Überschrift 8 Zchn"/>
-    <w:basedOn w:val="Absatz-Standardschriftart"/>
-    <w:link w:val="berschrift8"/>
+  <w:style w:type="character" w:customStyle="1" w:styleId="Heading8Char">
+    <w:name w:val="Heading 8 Char"/>
+    <w:basedOn w:val="DefaultParagraphFont"/>
+    <w:link w:val="Heading8"/>
     <w:uiPriority w:val="9"/>
     <w:semiHidden/>
     <w:rsid w:val="00A34021"/>
@@ -1221,10 +1350,10 @@
       <w:color w:val="272727" w:themeColor="text1" w:themeTint="D8"/>
     </w:rPr>
   </w:style>
-  <w:style w:type="character" w:customStyle="1" w:styleId="berschrift9Zchn">
-    <w:name w:val="Überschrift 9 Zchn"/>
-    <w:basedOn w:val="Absatz-Standardschriftart"/>
-    <w:link w:val="berschrift9"/>
+  <w:style w:type="character" w:customStyle="1" w:styleId="Heading9Char">
+    <w:name w:val="Heading 9 Char"/>
+    <w:basedOn w:val="DefaultParagraphFont"/>
+    <w:link w:val="Heading9"/>
     <w:uiPriority w:val="9"/>
     <w:semiHidden/>
     <w:rsid w:val="00A34021"/>
@@ -1233,11 +1362,11 @@
       <w:color w:val="272727" w:themeColor="text1" w:themeTint="D8"/>
     </w:rPr>
   </w:style>
-  <w:style w:type="paragraph" w:styleId="Titel">
+  <w:style w:type="paragraph" w:styleId="Title">
     <w:name w:val="Title"/>
-    <w:basedOn w:val="Standard"/>
-    <w:next w:val="Standard"/>
-    <w:link w:val="TitelZchn"/>
+    <w:basedOn w:val="Normal"/>
+    <w:next w:val="Normal"/>
+    <w:link w:val="TitleChar"/>
     <w:uiPriority w:val="10"/>
     <w:qFormat/>
     <w:rsid w:val="00A34021"/>
@@ -1253,10 +1382,10 @@
       <w:szCs w:val="56"/>
     </w:rPr>
   </w:style>
-  <w:style w:type="character" w:customStyle="1" w:styleId="TitelZchn">
-    <w:name w:val="Titel Zchn"/>
-    <w:basedOn w:val="Absatz-Standardschriftart"/>
-    <w:link w:val="Titel"/>
+  <w:style w:type="character" w:customStyle="1" w:styleId="TitleChar">
+    <w:name w:val="Title Char"/>
+    <w:basedOn w:val="DefaultParagraphFont"/>
+    <w:link w:val="Title"/>
     <w:uiPriority w:val="10"/>
     <w:rsid w:val="00A34021"/>
     <w:rPr>
@@ -1267,11 +1396,11 @@
       <w:szCs w:val="56"/>
     </w:rPr>
   </w:style>
-  <w:style w:type="paragraph" w:styleId="Untertitel">
+  <w:style w:type="paragraph" w:styleId="Subtitle">
     <w:name w:val="Subtitle"/>
-    <w:basedOn w:val="Standard"/>
-    <w:next w:val="Standard"/>
-    <w:link w:val="UntertitelZchn"/>
+    <w:basedOn w:val="Normal"/>
+    <w:next w:val="Normal"/>
+    <w:link w:val="SubtitleChar"/>
     <w:uiPriority w:val="11"/>
     <w:qFormat/>
     <w:rsid w:val="00A34021"/>
@@ -1288,10 +1417,10 @@
       <w:szCs w:val="28"/>
     </w:rPr>
   </w:style>
-  <w:style w:type="character" w:customStyle="1" w:styleId="UntertitelZchn">
-    <w:name w:val="Untertitel Zchn"/>
-    <w:basedOn w:val="Absatz-Standardschriftart"/>
-    <w:link w:val="Untertitel"/>
+  <w:style w:type="character" w:customStyle="1" w:styleId="SubtitleChar">
+    <w:name w:val="Subtitle Char"/>
+    <w:basedOn w:val="DefaultParagraphFont"/>
+    <w:link w:val="Subtitle"/>
     <w:uiPriority w:val="11"/>
     <w:rsid w:val="00A34021"/>
     <w:rPr>
@@ -1302,11 +1431,11 @@
       <w:szCs w:val="28"/>
     </w:rPr>
   </w:style>
-  <w:style w:type="paragraph" w:styleId="Zitat">
+  <w:style w:type="paragraph" w:styleId="Quote">
     <w:name w:val="Quote"/>
-    <w:basedOn w:val="Standard"/>
-    <w:next w:val="Standard"/>
-    <w:link w:val="ZitatZchn"/>
+    <w:basedOn w:val="Normal"/>
+    <w:next w:val="Normal"/>
+    <w:link w:val="QuoteChar"/>
     <w:uiPriority w:val="29"/>
     <w:qFormat/>
     <w:rsid w:val="00A34021"/>
@@ -1320,10 +1449,10 @@
       <w:color w:val="404040" w:themeColor="text1" w:themeTint="BF"/>
     </w:rPr>
   </w:style>
-  <w:style w:type="character" w:customStyle="1" w:styleId="ZitatZchn">
-    <w:name w:val="Zitat Zchn"/>
-    <w:basedOn w:val="Absatz-Standardschriftart"/>
-    <w:link w:val="Zitat"/>
+  <w:style w:type="character" w:customStyle="1" w:styleId="QuoteChar">
+    <w:name w:val="Quote Char"/>
+    <w:basedOn w:val="DefaultParagraphFont"/>
+    <w:link w:val="Quote"/>
     <w:uiPriority w:val="29"/>
     <w:rsid w:val="00A34021"/>
     <w:rPr>
@@ -1332,9 +1461,9 @@
       <w:color w:val="404040" w:themeColor="text1" w:themeTint="BF"/>
     </w:rPr>
   </w:style>
-  <w:style w:type="paragraph" w:styleId="Listenabsatz">
+  <w:style w:type="paragraph" w:styleId="ListParagraph">
     <w:name w:val="List Paragraph"/>
-    <w:basedOn w:val="Standard"/>
+    <w:basedOn w:val="Normal"/>
     <w:uiPriority w:val="34"/>
     <w:qFormat/>
     <w:rsid w:val="00A34021"/>
@@ -1343,9 +1472,9 @@
       <w:contextualSpacing/>
     </w:pPr>
   </w:style>
-  <w:style w:type="character" w:styleId="IntensiveHervorhebung">
+  <w:style w:type="character" w:styleId="IntenseEmphasis">
     <w:name w:val="Intense Emphasis"/>
-    <w:basedOn w:val="Absatz-Standardschriftart"/>
+    <w:basedOn w:val="DefaultParagraphFont"/>
     <w:uiPriority w:val="21"/>
     <w:qFormat/>
     <w:rsid w:val="00A34021"/>
@@ -1355,11 +1484,11 @@
       <w:color w:val="2F5496" w:themeColor="accent1" w:themeShade="BF"/>
     </w:rPr>
   </w:style>
-  <w:style w:type="paragraph" w:styleId="IntensivesZitat">
+  <w:style w:type="paragraph" w:styleId="IntenseQuote">
     <w:name w:val="Intense Quote"/>
-    <w:basedOn w:val="Standard"/>
-    <w:next w:val="Standard"/>
-    <w:link w:val="IntensivesZitatZchn"/>
+    <w:basedOn w:val="Normal"/>
+    <w:next w:val="Normal"/>
+    <w:link w:val="IntenseQuoteChar"/>
     <w:uiPriority w:val="30"/>
     <w:qFormat/>
     <w:rsid w:val="00A34021"/>
@@ -1378,10 +1507,10 @@
       <w:color w:val="2F5496" w:themeColor="accent1" w:themeShade="BF"/>
     </w:rPr>
   </w:style>
-  <w:style w:type="character" w:customStyle="1" w:styleId="IntensivesZitatZchn">
-    <w:name w:val="Intensives Zitat Zchn"/>
-    <w:basedOn w:val="Absatz-Standardschriftart"/>
-    <w:link w:val="IntensivesZitat"/>
+  <w:style w:type="character" w:customStyle="1" w:styleId="IntenseQuoteChar">
+    <w:name w:val="Intense Quote Char"/>
+    <w:basedOn w:val="DefaultParagraphFont"/>
+    <w:link w:val="IntenseQuote"/>
     <w:uiPriority w:val="30"/>
     <w:rsid w:val="00A34021"/>
     <w:rPr>
@@ -1390,9 +1519,9 @@
       <w:color w:val="2F5496" w:themeColor="accent1" w:themeShade="BF"/>
     </w:rPr>
   </w:style>
-  <w:style w:type="character" w:styleId="IntensiverVerweis">
+  <w:style w:type="character" w:styleId="IntenseReference">
     <w:name w:val="Intense Reference"/>
-    <w:basedOn w:val="Absatz-Standardschriftart"/>
+    <w:basedOn w:val="DefaultParagraphFont"/>
     <w:uiPriority w:val="32"/>
     <w:qFormat/>
     <w:rsid w:val="00A34021"/>

</xml_diff>